<commit_message>
26.03.26 meeting notes added
</commit_message>
<xml_diff>
--- a/meeting minutes/Consultant 1-1 meeting minutes .docx
+++ b/meeting minutes/Consultant 1-1 meeting minutes .docx
@@ -513,6 +513,193 @@
       </w:pPr>
       <w:r>
         <w:t>when submitting final diary submit full diary not just new entries since submission 1</w:t>
+      </w:r>
+    </w:p>
+    <w:p/>
+    <w:p>
+      <w:r>
+        <w:t>March 26, 2026</w:t>
+      </w:r>
+    </w:p>
+    <w:p>
+      <w:pPr>
+        <w:numPr>
+          <w:ilvl w:val="0"/>
+          <w:numId w:val="5"/>
+        </w:numPr>
+      </w:pPr>
+      <w:r>
+        <w:t>Question to ask consultant - What level of documentation is expected in the final submission for comments and implementation report</w:t>
+      </w:r>
+    </w:p>
+    <w:p>
+      <w:pPr>
+        <w:numPr>
+          <w:ilvl w:val="1"/>
+          <w:numId w:val="5"/>
+        </w:numPr>
+      </w:pPr>
+      <w:r>
+        <w:t>Comments are seen as a plus not mandatory</w:t>
+      </w:r>
+    </w:p>
+    <w:p>
+      <w:pPr>
+        <w:numPr>
+          <w:ilvl w:val="0"/>
+          <w:numId w:val="5"/>
+        </w:numPr>
+      </w:pPr>
+      <w:r>
+        <w:t>Question for consultant – will we get access to an example for the implementation report</w:t>
+      </w:r>
+    </w:p>
+    <w:p>
+      <w:pPr>
+        <w:numPr>
+          <w:ilvl w:val="1"/>
+          <w:numId w:val="5"/>
+        </w:numPr>
+      </w:pPr>
+      <w:r>
+        <w:t xml:space="preserve">Use the </w:t>
+      </w:r>
+      <w:proofErr w:type="gramStart"/>
+      <w:r>
+        <w:t>high level</w:t>
+      </w:r>
+      <w:proofErr w:type="gramEnd"/>
+      <w:r>
+        <w:t xml:space="preserve"> specification but remove requirements and high level design section – we will not get an example</w:t>
+      </w:r>
+    </w:p>
+    <w:p>
+      <w:pPr>
+        <w:numPr>
+          <w:ilvl w:val="1"/>
+          <w:numId w:val="5"/>
+        </w:numPr>
+      </w:pPr>
+      <w:r>
+        <w:t>Purpose and scope (can be kept)</w:t>
+      </w:r>
+    </w:p>
+    <w:p>
+      <w:pPr>
+        <w:numPr>
+          <w:ilvl w:val="1"/>
+          <w:numId w:val="5"/>
+        </w:numPr>
+      </w:pPr>
+      <w:r>
+        <w:t>Software</w:t>
+      </w:r>
+    </w:p>
+    <w:p>
+      <w:pPr>
+        <w:numPr>
+          <w:ilvl w:val="1"/>
+          <w:numId w:val="5"/>
+        </w:numPr>
+      </w:pPr>
+      <w:r>
+        <w:t>Compilation</w:t>
+      </w:r>
+    </w:p>
+    <w:p>
+      <w:pPr>
+        <w:numPr>
+          <w:ilvl w:val="1"/>
+          <w:numId w:val="5"/>
+        </w:numPr>
+      </w:pPr>
+      <w:r>
+        <w:t>Runtime components</w:t>
+      </w:r>
+    </w:p>
+    <w:p>
+      <w:pPr>
+        <w:numPr>
+          <w:ilvl w:val="1"/>
+          <w:numId w:val="5"/>
+        </w:numPr>
+      </w:pPr>
+      <w:r>
+        <w:t>Deployment of software</w:t>
+      </w:r>
+    </w:p>
+    <w:p>
+      <w:pPr>
+        <w:numPr>
+          <w:ilvl w:val="1"/>
+          <w:numId w:val="5"/>
+        </w:numPr>
+      </w:pPr>
+      <w:r>
+        <w:t xml:space="preserve">Look at lecture given during reading week – week 6 slide 4 </w:t>
+      </w:r>
+    </w:p>
+    <w:p>
+      <w:pPr>
+        <w:numPr>
+          <w:ilvl w:val="0"/>
+          <w:numId w:val="5"/>
+        </w:numPr>
+      </w:pPr>
+      <w:r>
+        <w:t xml:space="preserve">We can deploy our system all on one of our own laptops </w:t>
+      </w:r>
+    </w:p>
+    <w:p>
+      <w:pPr>
+        <w:numPr>
+          <w:ilvl w:val="0"/>
+          <w:numId w:val="5"/>
+        </w:numPr>
+      </w:pPr>
+      <w:r>
+        <w:t xml:space="preserve">Version control needs to get better from this point on – for word files just upload </w:t>
+      </w:r>
+    </w:p>
+    <w:p>
+      <w:pPr>
+        <w:numPr>
+          <w:ilvl w:val="0"/>
+          <w:numId w:val="5"/>
+        </w:numPr>
+      </w:pPr>
+      <w:r>
+        <w:t xml:space="preserve">Monday lecture will be </w:t>
+      </w:r>
+      <w:proofErr w:type="gramStart"/>
+      <w:r>
+        <w:t>recap</w:t>
+      </w:r>
+      <w:proofErr w:type="gramEnd"/>
+      <w:r>
+        <w:t xml:space="preserve"> session on implementation deliverables</w:t>
+      </w:r>
+    </w:p>
+    <w:p>
+      <w:pPr>
+        <w:numPr>
+          <w:ilvl w:val="1"/>
+          <w:numId w:val="5"/>
+        </w:numPr>
+      </w:pPr>
+      <w:r>
+        <w:t xml:space="preserve">We need a representative from our group to explain how we will integrate our system </w:t>
+      </w:r>
+    </w:p>
+    <w:p>
+      <w:pPr>
+        <w:numPr>
+          <w:ilvl w:val="2"/>
+          <w:numId w:val="5"/>
+        </w:numPr>
+      </w:pPr>
+      <w:r>
+        <w:t>E.g. “we will all use the same laptop”</w:t>
       </w:r>
     </w:p>
     <w:p/>
@@ -529,6 +716,119 @@
 <file path=word/numbering.xml><?xml version="1.0" encoding="utf-8"?>
 <w:numbering xmlns:wpc="http://schemas.microsoft.com/office/word/2010/wordprocessingCanvas" xmlns:cx="http://schemas.microsoft.com/office/drawing/2014/chartex" xmlns:cx1="http://schemas.microsoft.com/office/drawing/2015/9/8/chartex" xmlns:cx2="http://schemas.microsoft.com/office/drawing/2015/10/21/chartex" xmlns:cx3="http://schemas.microsoft.com/office/drawing/2016/5/9/chartex" xmlns:cx4="http://schemas.microsoft.com/office/drawing/2016/5/10/chartex" xmlns:cx5="http://schemas.microsoft.com/office/drawing/2016/5/11/chartex" xmlns:cx6="http://schemas.microsoft.com/office/drawing/2016/5/12/chartex" xmlns:cx7="http://schemas.microsoft.com/office/drawing/2016/5/13/chartex" xmlns:cx8="http://schemas.microsoft.com/office/drawing/2016/5/14/chartex" xmlns:mc="http://schemas.openxmlformats.org/markup-compatibility/2006" xmlns:aink="http://schemas.microsoft.com/office/drawing/2016/ink" xmlns:am3d="http://schemas.microsoft.com/office/drawing/2017/model3d" xmlns:o="urn:schemas-microsoft-com:office:office" xmlns:oel="http://schemas.microsoft.com/office/2019/extlst" xmlns:r="http://schemas.openxmlformats.org/officeDocument/2006/relationships" xmlns:m="http://schemas.openxmlformats.org/officeDocument/2006/math" xmlns:v="urn:schemas-microsoft-com:vml" xmlns:wp14="http://schemas.microsoft.com/office/word/2010/wordprocessingDrawing" xmlns:wp="http://schemas.openxmlformats.org/drawingml/2006/wordprocessingDrawing" xmlns:w10="urn:schemas-microsoft-com:office:word" xmlns:w="http://schemas.openxmlformats.org/wordprocessingml/2006/main" xmlns:w14="http://schemas.microsoft.com/office/word/2010/wordml" xmlns:w15="http://schemas.microsoft.com/office/word/2012/wordml" xmlns:w16cex="http://schemas.microsoft.com/office/word/2018/wordml/cex" xmlns:w16cid="http://schemas.microsoft.com/office/word/2016/wordml/cid" xmlns:w16="http://schemas.microsoft.com/office/word/2018/wordml" xmlns:w16du="http://schemas.microsoft.com/office/word/2023/wordml/word16du" xmlns:w16sdtdh="http://schemas.microsoft.com/office/word/2020/wordml/sdtdatahash" xmlns:w16se="http://schemas.microsoft.com/office/word/2015/wordml/symex" xmlns:wpg="http://schemas.microsoft.com/office/word/2010/wordprocessingGroup" xmlns:wpi="http://schemas.microsoft.com/office/word/2010/wordprocessingInk" xmlns:wne="http://schemas.microsoft.com/office/word/2006/wordml" xmlns:wps="http://schemas.microsoft.com/office/word/2010/wordprocessingShape" mc:Ignorable="w14 w15 w16se w16cid w16 w16cex w16sdtdh w16du wp14">
   <w:abstractNum w:abstractNumId="0" w15:restartNumberingAfterBreak="0">
+    <w:nsid w:val="2E744EC2"/>
+    <w:multiLevelType w:val="hybridMultilevel"/>
+    <w:tmpl w:val="ABF2DC92"/>
+    <w:lvl w:ilvl="0" w:tplc="08090001">
+      <w:start w:val="1"/>
+      <w:numFmt w:val="bullet"/>
+      <w:lvlText w:val=""/>
+      <w:lvlJc w:val="left"/>
+      <w:pPr>
+        <w:ind w:left="720" w:hanging="360"/>
+      </w:pPr>
+      <w:rPr>
+        <w:rFonts w:ascii="Symbol" w:hAnsi="Symbol" w:hint="default"/>
+      </w:rPr>
+    </w:lvl>
+    <w:lvl w:ilvl="1" w:tplc="08090003">
+      <w:start w:val="1"/>
+      <w:numFmt w:val="bullet"/>
+      <w:lvlText w:val="o"/>
+      <w:lvlJc w:val="left"/>
+      <w:pPr>
+        <w:ind w:left="1440" w:hanging="360"/>
+      </w:pPr>
+      <w:rPr>
+        <w:rFonts w:ascii="Courier New" w:hAnsi="Courier New" w:cs="Courier New" w:hint="default"/>
+      </w:rPr>
+    </w:lvl>
+    <w:lvl w:ilvl="2" w:tplc="08090005">
+      <w:start w:val="1"/>
+      <w:numFmt w:val="bullet"/>
+      <w:lvlText w:val=""/>
+      <w:lvlJc w:val="left"/>
+      <w:pPr>
+        <w:ind w:left="2160" w:hanging="360"/>
+      </w:pPr>
+      <w:rPr>
+        <w:rFonts w:ascii="Wingdings" w:hAnsi="Wingdings" w:hint="default"/>
+      </w:rPr>
+    </w:lvl>
+    <w:lvl w:ilvl="3" w:tplc="08090001">
+      <w:start w:val="1"/>
+      <w:numFmt w:val="bullet"/>
+      <w:lvlText w:val=""/>
+      <w:lvlJc w:val="left"/>
+      <w:pPr>
+        <w:ind w:left="2880" w:hanging="360"/>
+      </w:pPr>
+      <w:rPr>
+        <w:rFonts w:ascii="Symbol" w:hAnsi="Symbol" w:hint="default"/>
+      </w:rPr>
+    </w:lvl>
+    <w:lvl w:ilvl="4" w:tplc="08090003">
+      <w:start w:val="1"/>
+      <w:numFmt w:val="bullet"/>
+      <w:lvlText w:val="o"/>
+      <w:lvlJc w:val="left"/>
+      <w:pPr>
+        <w:ind w:left="3600" w:hanging="360"/>
+      </w:pPr>
+      <w:rPr>
+        <w:rFonts w:ascii="Courier New" w:hAnsi="Courier New" w:cs="Courier New" w:hint="default"/>
+      </w:rPr>
+    </w:lvl>
+    <w:lvl w:ilvl="5" w:tplc="08090005">
+      <w:start w:val="1"/>
+      <w:numFmt w:val="bullet"/>
+      <w:lvlText w:val=""/>
+      <w:lvlJc w:val="left"/>
+      <w:pPr>
+        <w:ind w:left="4320" w:hanging="360"/>
+      </w:pPr>
+      <w:rPr>
+        <w:rFonts w:ascii="Wingdings" w:hAnsi="Wingdings" w:hint="default"/>
+      </w:rPr>
+    </w:lvl>
+    <w:lvl w:ilvl="6" w:tplc="08090001">
+      <w:start w:val="1"/>
+      <w:numFmt w:val="bullet"/>
+      <w:lvlText w:val=""/>
+      <w:lvlJc w:val="left"/>
+      <w:pPr>
+        <w:ind w:left="5040" w:hanging="360"/>
+      </w:pPr>
+      <w:rPr>
+        <w:rFonts w:ascii="Symbol" w:hAnsi="Symbol" w:hint="default"/>
+      </w:rPr>
+    </w:lvl>
+    <w:lvl w:ilvl="7" w:tplc="08090003">
+      <w:start w:val="1"/>
+      <w:numFmt w:val="bullet"/>
+      <w:lvlText w:val="o"/>
+      <w:lvlJc w:val="left"/>
+      <w:pPr>
+        <w:ind w:left="5760" w:hanging="360"/>
+      </w:pPr>
+      <w:rPr>
+        <w:rFonts w:ascii="Courier New" w:hAnsi="Courier New" w:cs="Courier New" w:hint="default"/>
+      </w:rPr>
+    </w:lvl>
+    <w:lvl w:ilvl="8" w:tplc="08090005">
+      <w:start w:val="1"/>
+      <w:numFmt w:val="bullet"/>
+      <w:lvlText w:val=""/>
+      <w:lvlJc w:val="left"/>
+      <w:pPr>
+        <w:ind w:left="6480" w:hanging="360"/>
+      </w:pPr>
+      <w:rPr>
+        <w:rFonts w:ascii="Wingdings" w:hAnsi="Wingdings" w:hint="default"/>
+      </w:rPr>
+    </w:lvl>
+  </w:abstractNum>
+  <w:abstractNum w:abstractNumId="1" w15:restartNumberingAfterBreak="0">
     <w:nsid w:val="3CA677D8"/>
     <w:multiLevelType w:val="multilevel"/>
     <w:tmpl w:val="F64673CA"/>
@@ -677,7 +977,7 @@
       </w:rPr>
     </w:lvl>
   </w:abstractNum>
-  <w:abstractNum w:abstractNumId="1" w15:restartNumberingAfterBreak="0">
+  <w:abstractNum w:abstractNumId="2" w15:restartNumberingAfterBreak="0">
     <w:nsid w:val="3CA83A4F"/>
     <w:multiLevelType w:val="multilevel"/>
     <w:tmpl w:val="62585E5C"/>
@@ -826,7 +1126,7 @@
       </w:rPr>
     </w:lvl>
   </w:abstractNum>
-  <w:abstractNum w:abstractNumId="2" w15:restartNumberingAfterBreak="0">
+  <w:abstractNum w:abstractNumId="3" w15:restartNumberingAfterBreak="0">
     <w:nsid w:val="3CE855CE"/>
     <w:multiLevelType w:val="multilevel"/>
     <w:tmpl w:val="F62C8F34"/>
@@ -975,7 +1275,7 @@
       </w:rPr>
     </w:lvl>
   </w:abstractNum>
-  <w:abstractNum w:abstractNumId="3" w15:restartNumberingAfterBreak="0">
+  <w:abstractNum w:abstractNumId="4" w15:restartNumberingAfterBreak="0">
     <w:nsid w:val="3DC850D4"/>
     <w:multiLevelType w:val="multilevel"/>
     <w:tmpl w:val="55DA047C"/>
@@ -1125,16 +1425,28 @@
     </w:lvl>
   </w:abstractNum>
   <w:num w:numId="1" w16cid:durableId="545219069">
+    <w:abstractNumId w:val="3"/>
+  </w:num>
+  <w:num w:numId="2" w16cid:durableId="1142036522">
+    <w:abstractNumId w:val="4"/>
+  </w:num>
+  <w:num w:numId="3" w16cid:durableId="632175370">
     <w:abstractNumId w:val="2"/>
   </w:num>
-  <w:num w:numId="2" w16cid:durableId="1142036522">
-    <w:abstractNumId w:val="3"/>
-  </w:num>
-  <w:num w:numId="3" w16cid:durableId="632175370">
+  <w:num w:numId="4" w16cid:durableId="949896599">
     <w:abstractNumId w:val="1"/>
   </w:num>
-  <w:num w:numId="4" w16cid:durableId="949896599">
+  <w:num w:numId="5" w16cid:durableId="1321615132">
     <w:abstractNumId w:val="0"/>
+    <w:lvlOverride w:ilvl="0"/>
+    <w:lvlOverride w:ilvl="1"/>
+    <w:lvlOverride w:ilvl="2"/>
+    <w:lvlOverride w:ilvl="3"/>
+    <w:lvlOverride w:ilvl="4"/>
+    <w:lvlOverride w:ilvl="5"/>
+    <w:lvlOverride w:ilvl="6"/>
+    <w:lvlOverride w:ilvl="7"/>
+    <w:lvlOverride w:ilvl="8"/>
   </w:num>
 </w:numbering>
 </file>

</xml_diff>